<commit_message>
Mudança do arquivo que estava errada assinatura
</commit_message>
<xml_diff>
--- a/Documentation/Sprint12_Task076_refatorarlogcapesquisar.docx
+++ b/Documentation/Sprint12_Task076_refatorarlogcapesquisar.docx
@@ -1,6 +1,6 @@
 
 <file path=word/document.xml><?xml version="1.0" encoding="utf-8"?>
-<w:document xmlns:wpc="http://schemas.microsoft.com/office/word/2010/wordprocessingCanvas" xmlns:cx="http://schemas.microsoft.com/office/drawing/2014/chartex" xmlns:cx1="http://schemas.microsoft.com/office/drawing/2015/9/8/chartex" xmlns:cx2="http://schemas.microsoft.com/office/drawing/2015/10/21/chartex" xmlns:cx3="http://schemas.microsoft.com/office/drawing/2016/5/9/chartex" xmlns:cx4="http://schemas.microsoft.com/office/drawing/2016/5/10/chartex" xmlns:cx5="http://schemas.microsoft.com/office/drawing/2016/5/11/chartex" xmlns:cx6="http://schemas.microsoft.com/office/drawing/2016/5/12/chartex" xmlns:cx7="http://schemas.microsoft.com/office/drawing/2016/5/13/chartex" xmlns:cx8="http://schemas.microsoft.com/office/drawing/2016/5/14/chartex" xmlns:mc="http://schemas.openxmlformats.org/markup-compatibility/2006" xmlns:aink="http://schemas.microsoft.com/office/drawing/2016/ink" xmlns:am3d="http://schemas.microsoft.com/office/drawing/2017/model3d" xmlns:o="urn:schemas-microsoft-com:office:office" xmlns:oel="http://schemas.microsoft.com/office/2019/extlst" xmlns:r="http://schemas.openxmlformats.org/officeDocument/2006/relationships" xmlns:m="http://schemas.openxmlformats.org/officeDocument/2006/math" xmlns:v="urn:schemas-microsoft-com:vml" xmlns:wp14="http://schemas.microsoft.com/office/word/2010/wordprocessingDrawing" xmlns:wp="http://schemas.openxmlformats.org/drawingml/2006/wordprocessingDrawing" xmlns:w10="urn:schemas-microsoft-com:office:word" xmlns:w="http://schemas.openxmlformats.org/wordprocessingml/2006/main" xmlns:w14="http://schemas.microsoft.com/office/word/2010/wordml" xmlns:w15="http://schemas.microsoft.com/office/word/2012/wordml" xmlns:w16cex="http://schemas.microsoft.com/office/word/2018/wordml/cex" xmlns:w16cid="http://schemas.microsoft.com/office/word/2016/wordml/cid" xmlns:w16="http://schemas.microsoft.com/office/word/2018/wordml" xmlns:w16du="http://schemas.microsoft.com/office/word/2023/wordml/word16du" xmlns:w16sdtdh="http://schemas.microsoft.com/office/word/2020/wordml/sdtdatahash" xmlns:w16sdtfl="http://schemas.microsoft.com/office/word/2024/wordml/sdtformatlock" xmlns:w16se="http://schemas.microsoft.com/office/word/2015/wordml/symex" xmlns:wpg="http://schemas.microsoft.com/office/word/2010/wordprocessingGroup" xmlns:wpi="http://schemas.microsoft.com/office/word/2010/wordprocessingInk" xmlns:wne="http://schemas.microsoft.com/office/word/2006/wordml" xmlns:wps="http://schemas.microsoft.com/office/word/2010/wordprocessingShape" mc:Ignorable="w14 w15 w16se w16cid w16 w16cex w16sdtdh w16sdtfl w16du wp14">
+<w:document xmlns:wpc="http://schemas.microsoft.com/office/word/2010/wordprocessingCanvas" xmlns:cx="http://schemas.microsoft.com/office/drawing/2014/chartex" xmlns:cx1="http://schemas.microsoft.com/office/drawing/2015/9/8/chartex" xmlns:cx2="http://schemas.microsoft.com/office/drawing/2015/10/21/chartex" xmlns:cx3="http://schemas.microsoft.com/office/drawing/2016/5/9/chartex" xmlns:cx4="http://schemas.microsoft.com/office/drawing/2016/5/10/chartex" xmlns:cx5="http://schemas.microsoft.com/office/drawing/2016/5/11/chartex" xmlns:cx6="http://schemas.microsoft.com/office/drawing/2016/5/12/chartex" xmlns:cx7="http://schemas.microsoft.com/office/drawing/2016/5/13/chartex" xmlns:cx8="http://schemas.microsoft.com/office/drawing/2016/5/14/chartex" xmlns:mc="http://schemas.openxmlformats.org/markup-compatibility/2006" xmlns:aink="http://schemas.microsoft.com/office/drawing/2016/ink" xmlns:am3d="http://schemas.microsoft.com/office/drawing/2017/model3d" xmlns:o="urn:schemas-microsoft-com:office:office" xmlns:oel="http://schemas.microsoft.com/office/2019/extlst" xmlns:r="http://schemas.openxmlformats.org/officeDocument/2006/relationships" xmlns:m="http://schemas.openxmlformats.org/officeDocument/2006/math" xmlns:v="urn:schemas-microsoft-com:vml" xmlns:wp14="http://schemas.microsoft.com/office/word/2010/wordprocessingDrawing" xmlns:wp="http://schemas.openxmlformats.org/drawingml/2006/wordprocessingDrawing" xmlns:w10="urn:schemas-microsoft-com:office:word" xmlns:w="http://schemas.openxmlformats.org/wordprocessingml/2006/main" xmlns:w14="http://schemas.microsoft.com/office/word/2010/wordml" xmlns:w15="http://schemas.microsoft.com/office/word/2012/wordml" xmlns:w16cex="http://schemas.microsoft.com/office/word/2018/wordml/cex" xmlns:w16cid="http://schemas.microsoft.com/office/word/2016/wordml/cid" xmlns:w16="http://schemas.microsoft.com/office/word/2018/wordml" xmlns:w16sdtdh="http://schemas.microsoft.com/office/word/2020/wordml/sdtdatahash" xmlns:w16se="http://schemas.microsoft.com/office/word/2015/wordml/symex" xmlns:wpg="http://schemas.microsoft.com/office/word/2010/wordprocessingGroup" xmlns:wpi="http://schemas.microsoft.com/office/word/2010/wordprocessingInk" xmlns:wne="http://schemas.microsoft.com/office/word/2006/wordml" xmlns:wps="http://schemas.microsoft.com/office/word/2010/wordprocessingShape" mc:Ignorable="w14 w15 w16se w16cid w16 w16cex w16sdtdh wp14">
   <w:body>
     <w:p>
       <w:pPr>
@@ -145,7 +145,7 @@
                 <w:b/>
                 <w:bCs/>
               </w:rPr>
-              <w:t>03</w:t>
+              <w:t>12</w:t>
             </w:r>
           </w:p>
         </w:tc>
@@ -313,7 +313,7 @@
                 <w:b/>
                 <w:bCs/>
               </w:rPr>
-              <w:t>4</w:t>
+              <w:t>5</w:t>
             </w:r>
             <w:r>
               <w:rPr>
@@ -546,7 +546,10 @@
           </w:tcPr>
           <w:p>
             <w:r>
-              <w:t>02/03/2026</w:t>
+              <w:t>09</w:t>
+            </w:r>
+            <w:r>
+              <w:t>/03/2026</w:t>
             </w:r>
           </w:p>
         </w:tc>
@@ -725,10 +728,7 @@
               <w:t xml:space="preserve"> Thiago de Oliveira Francisco</w:t>
             </w:r>
             <w:r>
-              <w:t xml:space="preserve">, </w:t>
-            </w:r>
-            <w:r>
-              <w:t>Arthur Pires da Costa.</w:t>
+              <w:t>, Arthur Pires da Costa.</w:t>
             </w:r>
           </w:p>
         </w:tc>
@@ -971,7 +971,7 @@
           <w:rFonts w:cs="Segoe UI Emoji"/>
         </w:rPr>
         <w:pict w14:anchorId="564D0525">
-          <v:rect id="_x0000_i1077" style="width:0;height:3pt" o:hralign="center" o:hrstd="t" o:hr="t" fillcolor="#a0a0a0" stroked="f"/>
+          <v:rect id="_x0000_i1025" style="width:0;height:3pt" o:hralign="center" o:hrstd="t" o:hr="t" fillcolor="#a0a0a0" stroked="f"/>
         </w:pict>
       </w:r>
     </w:p>
@@ -1113,7 +1113,7 @@
           <w:rFonts w:cs="Segoe UI Emoji"/>
         </w:rPr>
         <w:pict w14:anchorId="63CB3096">
-          <v:rect id="_x0000_i1078" style="width:0;height:3pt" o:hralign="center" o:hrstd="t" o:hr="t" fillcolor="#a0a0a0" stroked="f"/>
+          <v:rect id="_x0000_i1026" style="width:0;height:3pt" o:hralign="center" o:hrstd="t" o:hr="t" fillcolor="#a0a0a0" stroked="f"/>
         </w:pict>
       </w:r>
     </w:p>
@@ -1539,7 +1539,7 @@
 </file>
 
 <file path=word/endnotes.xml><?xml version="1.0" encoding="utf-8"?>
-<w:endnotes xmlns:wpc="http://schemas.microsoft.com/office/word/2010/wordprocessingCanvas" xmlns:cx="http://schemas.microsoft.com/office/drawing/2014/chartex" xmlns:cx1="http://schemas.microsoft.com/office/drawing/2015/9/8/chartex" xmlns:cx2="http://schemas.microsoft.com/office/drawing/2015/10/21/chartex" xmlns:cx3="http://schemas.microsoft.com/office/drawing/2016/5/9/chartex" xmlns:cx4="http://schemas.microsoft.com/office/drawing/2016/5/10/chartex" xmlns:cx5="http://schemas.microsoft.com/office/drawing/2016/5/11/chartex" xmlns:cx6="http://schemas.microsoft.com/office/drawing/2016/5/12/chartex" xmlns:cx7="http://schemas.microsoft.com/office/drawing/2016/5/13/chartex" xmlns:cx8="http://schemas.microsoft.com/office/drawing/2016/5/14/chartex" xmlns:mc="http://schemas.openxmlformats.org/markup-compatibility/2006" xmlns:aink="http://schemas.microsoft.com/office/drawing/2016/ink" xmlns:am3d="http://schemas.microsoft.com/office/drawing/2017/model3d" xmlns:o="urn:schemas-microsoft-com:office:office" xmlns:oel="http://schemas.microsoft.com/office/2019/extlst" xmlns:r="http://schemas.openxmlformats.org/officeDocument/2006/relationships" xmlns:m="http://schemas.openxmlformats.org/officeDocument/2006/math" xmlns:v="urn:schemas-microsoft-com:vml" xmlns:wp14="http://schemas.microsoft.com/office/word/2010/wordprocessingDrawing" xmlns:wp="http://schemas.openxmlformats.org/drawingml/2006/wordprocessingDrawing" xmlns:w10="urn:schemas-microsoft-com:office:word" xmlns:w="http://schemas.openxmlformats.org/wordprocessingml/2006/main" xmlns:w14="http://schemas.microsoft.com/office/word/2010/wordml" xmlns:w15="http://schemas.microsoft.com/office/word/2012/wordml" xmlns:w16cex="http://schemas.microsoft.com/office/word/2018/wordml/cex" xmlns:w16cid="http://schemas.microsoft.com/office/word/2016/wordml/cid" xmlns:w16="http://schemas.microsoft.com/office/word/2018/wordml" xmlns:w16du="http://schemas.microsoft.com/office/word/2023/wordml/word16du" xmlns:w16sdtdh="http://schemas.microsoft.com/office/word/2020/wordml/sdtdatahash" xmlns:w16sdtfl="http://schemas.microsoft.com/office/word/2024/wordml/sdtformatlock" xmlns:w16se="http://schemas.microsoft.com/office/word/2015/wordml/symex" xmlns:wpg="http://schemas.microsoft.com/office/word/2010/wordprocessingGroup" xmlns:wpi="http://schemas.microsoft.com/office/word/2010/wordprocessingInk" xmlns:wne="http://schemas.microsoft.com/office/word/2006/wordml" xmlns:wps="http://schemas.microsoft.com/office/word/2010/wordprocessingShape" mc:Ignorable="w14 w15 w16se w16cid w16 w16cex w16sdtdh w16sdtfl w16du wp14">
+<w:endnotes xmlns:wpc="http://schemas.microsoft.com/office/word/2010/wordprocessingCanvas" xmlns:cx="http://schemas.microsoft.com/office/drawing/2014/chartex" xmlns:cx1="http://schemas.microsoft.com/office/drawing/2015/9/8/chartex" xmlns:cx2="http://schemas.microsoft.com/office/drawing/2015/10/21/chartex" xmlns:cx3="http://schemas.microsoft.com/office/drawing/2016/5/9/chartex" xmlns:cx4="http://schemas.microsoft.com/office/drawing/2016/5/10/chartex" xmlns:cx5="http://schemas.microsoft.com/office/drawing/2016/5/11/chartex" xmlns:cx6="http://schemas.microsoft.com/office/drawing/2016/5/12/chartex" xmlns:cx7="http://schemas.microsoft.com/office/drawing/2016/5/13/chartex" xmlns:cx8="http://schemas.microsoft.com/office/drawing/2016/5/14/chartex" xmlns:mc="http://schemas.openxmlformats.org/markup-compatibility/2006" xmlns:aink="http://schemas.microsoft.com/office/drawing/2016/ink" xmlns:am3d="http://schemas.microsoft.com/office/drawing/2017/model3d" xmlns:o="urn:schemas-microsoft-com:office:office" xmlns:oel="http://schemas.microsoft.com/office/2019/extlst" xmlns:r="http://schemas.openxmlformats.org/officeDocument/2006/relationships" xmlns:m="http://schemas.openxmlformats.org/officeDocument/2006/math" xmlns:v="urn:schemas-microsoft-com:vml" xmlns:wp14="http://schemas.microsoft.com/office/word/2010/wordprocessingDrawing" xmlns:wp="http://schemas.openxmlformats.org/drawingml/2006/wordprocessingDrawing" xmlns:w10="urn:schemas-microsoft-com:office:word" xmlns:w="http://schemas.openxmlformats.org/wordprocessingml/2006/main" xmlns:w14="http://schemas.microsoft.com/office/word/2010/wordml" xmlns:w15="http://schemas.microsoft.com/office/word/2012/wordml" xmlns:w16cex="http://schemas.microsoft.com/office/word/2018/wordml/cex" xmlns:w16cid="http://schemas.microsoft.com/office/word/2016/wordml/cid" xmlns:w16="http://schemas.microsoft.com/office/word/2018/wordml" xmlns:w16sdtdh="http://schemas.microsoft.com/office/word/2020/wordml/sdtdatahash" xmlns:w16se="http://schemas.microsoft.com/office/word/2015/wordml/symex" xmlns:wpg="http://schemas.microsoft.com/office/word/2010/wordprocessingGroup" xmlns:wpi="http://schemas.microsoft.com/office/word/2010/wordprocessingInk" xmlns:wne="http://schemas.microsoft.com/office/word/2006/wordml" xmlns:wps="http://schemas.microsoft.com/office/word/2010/wordprocessingShape" mc:Ignorable="w14 w15 w16se w16cid w16 w16cex w16sdtdh wp14">
   <w:endnote w:type="separator" w:id="-1">
     <w:p>
       <w:pPr>
@@ -1564,7 +1564,7 @@
 </file>
 
 <file path=word/footnotes.xml><?xml version="1.0" encoding="utf-8"?>
-<w:footnotes xmlns:wpc="http://schemas.microsoft.com/office/word/2010/wordprocessingCanvas" xmlns:cx="http://schemas.microsoft.com/office/drawing/2014/chartex" xmlns:cx1="http://schemas.microsoft.com/office/drawing/2015/9/8/chartex" xmlns:cx2="http://schemas.microsoft.com/office/drawing/2015/10/21/chartex" xmlns:cx3="http://schemas.microsoft.com/office/drawing/2016/5/9/chartex" xmlns:cx4="http://schemas.microsoft.com/office/drawing/2016/5/10/chartex" xmlns:cx5="http://schemas.microsoft.com/office/drawing/2016/5/11/chartex" xmlns:cx6="http://schemas.microsoft.com/office/drawing/2016/5/12/chartex" xmlns:cx7="http://schemas.microsoft.com/office/drawing/2016/5/13/chartex" xmlns:cx8="http://schemas.microsoft.com/office/drawing/2016/5/14/chartex" xmlns:mc="http://schemas.openxmlformats.org/markup-compatibility/2006" xmlns:aink="http://schemas.microsoft.com/office/drawing/2016/ink" xmlns:am3d="http://schemas.microsoft.com/office/drawing/2017/model3d" xmlns:o="urn:schemas-microsoft-com:office:office" xmlns:oel="http://schemas.microsoft.com/office/2019/extlst" xmlns:r="http://schemas.openxmlformats.org/officeDocument/2006/relationships" xmlns:m="http://schemas.openxmlformats.org/officeDocument/2006/math" xmlns:v="urn:schemas-microsoft-com:vml" xmlns:wp14="http://schemas.microsoft.com/office/word/2010/wordprocessingDrawing" xmlns:wp="http://schemas.openxmlformats.org/drawingml/2006/wordprocessingDrawing" xmlns:w10="urn:schemas-microsoft-com:office:word" xmlns:w="http://schemas.openxmlformats.org/wordprocessingml/2006/main" xmlns:w14="http://schemas.microsoft.com/office/word/2010/wordml" xmlns:w15="http://schemas.microsoft.com/office/word/2012/wordml" xmlns:w16cex="http://schemas.microsoft.com/office/word/2018/wordml/cex" xmlns:w16cid="http://schemas.microsoft.com/office/word/2016/wordml/cid" xmlns:w16="http://schemas.microsoft.com/office/word/2018/wordml" xmlns:w16du="http://schemas.microsoft.com/office/word/2023/wordml/word16du" xmlns:w16sdtdh="http://schemas.microsoft.com/office/word/2020/wordml/sdtdatahash" xmlns:w16sdtfl="http://schemas.microsoft.com/office/word/2024/wordml/sdtformatlock" xmlns:w16se="http://schemas.microsoft.com/office/word/2015/wordml/symex" xmlns:wpg="http://schemas.microsoft.com/office/word/2010/wordprocessingGroup" xmlns:wpi="http://schemas.microsoft.com/office/word/2010/wordprocessingInk" xmlns:wne="http://schemas.microsoft.com/office/word/2006/wordml" xmlns:wps="http://schemas.microsoft.com/office/word/2010/wordprocessingShape" mc:Ignorable="w14 w15 w16se w16cid w16 w16cex w16sdtdh w16sdtfl w16du wp14">
+<w:footnotes xmlns:wpc="http://schemas.microsoft.com/office/word/2010/wordprocessingCanvas" xmlns:cx="http://schemas.microsoft.com/office/drawing/2014/chartex" xmlns:cx1="http://schemas.microsoft.com/office/drawing/2015/9/8/chartex" xmlns:cx2="http://schemas.microsoft.com/office/drawing/2015/10/21/chartex" xmlns:cx3="http://schemas.microsoft.com/office/drawing/2016/5/9/chartex" xmlns:cx4="http://schemas.microsoft.com/office/drawing/2016/5/10/chartex" xmlns:cx5="http://schemas.microsoft.com/office/drawing/2016/5/11/chartex" xmlns:cx6="http://schemas.microsoft.com/office/drawing/2016/5/12/chartex" xmlns:cx7="http://schemas.microsoft.com/office/drawing/2016/5/13/chartex" xmlns:cx8="http://schemas.microsoft.com/office/drawing/2016/5/14/chartex" xmlns:mc="http://schemas.openxmlformats.org/markup-compatibility/2006" xmlns:aink="http://schemas.microsoft.com/office/drawing/2016/ink" xmlns:am3d="http://schemas.microsoft.com/office/drawing/2017/model3d" xmlns:o="urn:schemas-microsoft-com:office:office" xmlns:oel="http://schemas.microsoft.com/office/2019/extlst" xmlns:r="http://schemas.openxmlformats.org/officeDocument/2006/relationships" xmlns:m="http://schemas.openxmlformats.org/officeDocument/2006/math" xmlns:v="urn:schemas-microsoft-com:vml" xmlns:wp14="http://schemas.microsoft.com/office/word/2010/wordprocessingDrawing" xmlns:wp="http://schemas.openxmlformats.org/drawingml/2006/wordprocessingDrawing" xmlns:w10="urn:schemas-microsoft-com:office:word" xmlns:w="http://schemas.openxmlformats.org/wordprocessingml/2006/main" xmlns:w14="http://schemas.microsoft.com/office/word/2010/wordml" xmlns:w15="http://schemas.microsoft.com/office/word/2012/wordml" xmlns:w16cex="http://schemas.microsoft.com/office/word/2018/wordml/cex" xmlns:w16cid="http://schemas.microsoft.com/office/word/2016/wordml/cid" xmlns:w16="http://schemas.microsoft.com/office/word/2018/wordml" xmlns:w16sdtdh="http://schemas.microsoft.com/office/word/2020/wordml/sdtdatahash" xmlns:w16se="http://schemas.microsoft.com/office/word/2015/wordml/symex" xmlns:wpg="http://schemas.microsoft.com/office/word/2010/wordprocessingGroup" xmlns:wpi="http://schemas.microsoft.com/office/word/2010/wordprocessingInk" xmlns:wne="http://schemas.microsoft.com/office/word/2006/wordml" xmlns:wps="http://schemas.microsoft.com/office/word/2010/wordprocessingShape" mc:Ignorable="w14 w15 w16se w16cid w16 w16cex w16sdtdh wp14">
   <w:footnote w:type="separator" w:id="-1">
     <w:p>
       <w:pPr>
@@ -1589,7 +1589,7 @@
 </file>
 
 <file path=word/numbering.xml><?xml version="1.0" encoding="utf-8"?>
-<w:numbering xmlns:wpc="http://schemas.microsoft.com/office/word/2010/wordprocessingCanvas" xmlns:cx="http://schemas.microsoft.com/office/drawing/2014/chartex" xmlns:cx1="http://schemas.microsoft.com/office/drawing/2015/9/8/chartex" xmlns:cx2="http://schemas.microsoft.com/office/drawing/2015/10/21/chartex" xmlns:cx3="http://schemas.microsoft.com/office/drawing/2016/5/9/chartex" xmlns:cx4="http://schemas.microsoft.com/office/drawing/2016/5/10/chartex" xmlns:cx5="http://schemas.microsoft.com/office/drawing/2016/5/11/chartex" xmlns:cx6="http://schemas.microsoft.com/office/drawing/2016/5/12/chartex" xmlns:cx7="http://schemas.microsoft.com/office/drawing/2016/5/13/chartex" xmlns:cx8="http://schemas.microsoft.com/office/drawing/2016/5/14/chartex" xmlns:mc="http://schemas.openxmlformats.org/markup-compatibility/2006" xmlns:aink="http://schemas.microsoft.com/office/drawing/2016/ink" xmlns:am3d="http://schemas.microsoft.com/office/drawing/2017/model3d" xmlns:o="urn:schemas-microsoft-com:office:office" xmlns:oel="http://schemas.microsoft.com/office/2019/extlst" xmlns:r="http://schemas.openxmlformats.org/officeDocument/2006/relationships" xmlns:m="http://schemas.openxmlformats.org/officeDocument/2006/math" xmlns:v="urn:schemas-microsoft-com:vml" xmlns:wp14="http://schemas.microsoft.com/office/word/2010/wordprocessingDrawing" xmlns:wp="http://schemas.openxmlformats.org/drawingml/2006/wordprocessingDrawing" xmlns:w10="urn:schemas-microsoft-com:office:word" xmlns:w="http://schemas.openxmlformats.org/wordprocessingml/2006/main" xmlns:w14="http://schemas.microsoft.com/office/word/2010/wordml" xmlns:w15="http://schemas.microsoft.com/office/word/2012/wordml" xmlns:w16cex="http://schemas.microsoft.com/office/word/2018/wordml/cex" xmlns:w16cid="http://schemas.microsoft.com/office/word/2016/wordml/cid" xmlns:w16="http://schemas.microsoft.com/office/word/2018/wordml" xmlns:w16du="http://schemas.microsoft.com/office/word/2023/wordml/word16du" xmlns:w16sdtdh="http://schemas.microsoft.com/office/word/2020/wordml/sdtdatahash" xmlns:w16sdtfl="http://schemas.microsoft.com/office/word/2024/wordml/sdtformatlock" xmlns:w16se="http://schemas.microsoft.com/office/word/2015/wordml/symex" xmlns:wpg="http://schemas.microsoft.com/office/word/2010/wordprocessingGroup" xmlns:wpi="http://schemas.microsoft.com/office/word/2010/wordprocessingInk" xmlns:wne="http://schemas.microsoft.com/office/word/2006/wordml" xmlns:wps="http://schemas.microsoft.com/office/word/2010/wordprocessingShape" mc:Ignorable="w14 w15 w16se w16cid w16 w16cex w16sdtdh w16sdtfl w16du wp14">
+<w:numbering xmlns:wpc="http://schemas.microsoft.com/office/word/2010/wordprocessingCanvas" xmlns:cx="http://schemas.microsoft.com/office/drawing/2014/chartex" xmlns:cx1="http://schemas.microsoft.com/office/drawing/2015/9/8/chartex" xmlns:cx2="http://schemas.microsoft.com/office/drawing/2015/10/21/chartex" xmlns:cx3="http://schemas.microsoft.com/office/drawing/2016/5/9/chartex" xmlns:cx4="http://schemas.microsoft.com/office/drawing/2016/5/10/chartex" xmlns:cx5="http://schemas.microsoft.com/office/drawing/2016/5/11/chartex" xmlns:cx6="http://schemas.microsoft.com/office/drawing/2016/5/12/chartex" xmlns:cx7="http://schemas.microsoft.com/office/drawing/2016/5/13/chartex" xmlns:cx8="http://schemas.microsoft.com/office/drawing/2016/5/14/chartex" xmlns:mc="http://schemas.openxmlformats.org/markup-compatibility/2006" xmlns:aink="http://schemas.microsoft.com/office/drawing/2016/ink" xmlns:am3d="http://schemas.microsoft.com/office/drawing/2017/model3d" xmlns:o="urn:schemas-microsoft-com:office:office" xmlns:oel="http://schemas.microsoft.com/office/2019/extlst" xmlns:r="http://schemas.openxmlformats.org/officeDocument/2006/relationships" xmlns:m="http://schemas.openxmlformats.org/officeDocument/2006/math" xmlns:v="urn:schemas-microsoft-com:vml" xmlns:wp14="http://schemas.microsoft.com/office/word/2010/wordprocessingDrawing" xmlns:wp="http://schemas.openxmlformats.org/drawingml/2006/wordprocessingDrawing" xmlns:w10="urn:schemas-microsoft-com:office:word" xmlns:w="http://schemas.openxmlformats.org/wordprocessingml/2006/main" xmlns:w14="http://schemas.microsoft.com/office/word/2010/wordml" xmlns:w15="http://schemas.microsoft.com/office/word/2012/wordml" xmlns:w16cex="http://schemas.microsoft.com/office/word/2018/wordml/cex" xmlns:w16cid="http://schemas.microsoft.com/office/word/2016/wordml/cid" xmlns:w16="http://schemas.microsoft.com/office/word/2018/wordml" xmlns:w16sdtdh="http://schemas.microsoft.com/office/word/2020/wordml/sdtdatahash" xmlns:w16se="http://schemas.microsoft.com/office/word/2015/wordml/symex" xmlns:wpg="http://schemas.microsoft.com/office/word/2010/wordprocessingGroup" xmlns:wpi="http://schemas.microsoft.com/office/word/2010/wordprocessingInk" xmlns:wne="http://schemas.microsoft.com/office/word/2006/wordml" xmlns:wps="http://schemas.microsoft.com/office/word/2010/wordprocessingShape" mc:Ignorable="w14 w15 w16se w16cid w16 w16cex w16sdtdh wp14">
   <w:abstractNum w:abstractNumId="0" w15:restartNumberingAfterBreak="0">
     <w:nsid w:val="2D135BD1"/>
     <w:multiLevelType w:val="multilevel"/>
@@ -2166,7 +2166,7 @@
 </file>
 
 <file path=word/styles.xml><?xml version="1.0" encoding="utf-8"?>
-<w:styles xmlns:mc="http://schemas.openxmlformats.org/markup-compatibility/2006" xmlns:r="http://schemas.openxmlformats.org/officeDocument/2006/relationships" xmlns:w="http://schemas.openxmlformats.org/wordprocessingml/2006/main" xmlns:w14="http://schemas.microsoft.com/office/word/2010/wordml" xmlns:w15="http://schemas.microsoft.com/office/word/2012/wordml" xmlns:w16cex="http://schemas.microsoft.com/office/word/2018/wordml/cex" xmlns:w16cid="http://schemas.microsoft.com/office/word/2016/wordml/cid" xmlns:w16="http://schemas.microsoft.com/office/word/2018/wordml" xmlns:w16du="http://schemas.microsoft.com/office/word/2023/wordml/word16du" xmlns:w16sdtdh="http://schemas.microsoft.com/office/word/2020/wordml/sdtdatahash" xmlns:w16sdtfl="http://schemas.microsoft.com/office/word/2024/wordml/sdtformatlock" xmlns:w16se="http://schemas.microsoft.com/office/word/2015/wordml/symex" mc:Ignorable="w14 w15 w16se w16cid w16 w16cex w16sdtdh w16sdtfl w16du">
+<w:styles xmlns:mc="http://schemas.openxmlformats.org/markup-compatibility/2006" xmlns:r="http://schemas.openxmlformats.org/officeDocument/2006/relationships" xmlns:w="http://schemas.openxmlformats.org/wordprocessingml/2006/main" xmlns:w14="http://schemas.microsoft.com/office/word/2010/wordml" xmlns:w15="http://schemas.microsoft.com/office/word/2012/wordml" xmlns:w16cex="http://schemas.microsoft.com/office/word/2018/wordml/cex" xmlns:w16cid="http://schemas.microsoft.com/office/word/2016/wordml/cid" xmlns:w16="http://schemas.microsoft.com/office/word/2018/wordml" xmlns:w16sdtdh="http://schemas.microsoft.com/office/word/2020/wordml/sdtdatahash" xmlns:w16se="http://schemas.microsoft.com/office/word/2015/wordml/symex" mc:Ignorable="w14 w15 w16se w16cid w16 w16cex w16sdtdh">
   <w:docDefaults>
     <w:rPrDefault>
       <w:rPr>
@@ -2768,6 +2768,7 @@
   <w:style w:type="character" w:default="1" w:styleId="Fontepargpadro">
     <w:name w:val="Default Paragraph Font"/>
     <w:uiPriority w:val="1"/>
+    <w:semiHidden/>
     <w:unhideWhenUsed/>
   </w:style>
   <w:style w:type="table" w:default="1" w:styleId="Tabelanormal">

</xml_diff>